<commit_message>
Add --agent-cmd external agent protocol; make Mem0 listing complete or fail loudly; pin tested extras
Co-Authored-By: Claude Sonnet 5.5 <noreply@anthropic.com>
Claude-Session: https://claude.ai/code/session_01BuQd2CwyDwvp7AghJCtKtV
</commit_message>
<xml_diff>
--- a/docs/intro/Riffnel_memguard_作品介绍.docx
+++ b/docs/intro/Riffnel_memguard_作品介绍.docx
@@ -1272,7 +1272,7 @@
                 <w:sz w:val="19"/>
                 <w:szCs w:val="19"/>
               </w:rPr>
-              <w:t xml:space="preserve">v0.1 预览，已可运行：约 2500 行 Python 核心代码，52 项自动化测试，持续集成（Python 3.10、3.12、容器镜像）通过。适配器：JSON、SQLite、Mem0；另可导入 memwall 扫描结果。</w:t>
+              <w:t xml:space="preserve">v0.1 预览，已可运行：约 2500 行 Python 核心代码，69 项自动化测试，持续集成（Python 3.10、3.12、容器镜像）通过。适配器：JSON、SQLite、Mem0；另可导入 memwall 扫描结果。</w:t>
             </w:r>
           </w:p>
         </w:tc>
@@ -5272,6 +5272,61 @@
           <w:sz w:val="21"/>
           <w:szCs w:val="21"/>
         </w:rPr>
+        <w:t xml:space="preserve">任意智能体接入（</w:t>
+      </w:r>
+      <w:r>
+        <w:rPr>
+          <w:rFonts w:ascii="Consolas" w:eastAsia="SimSun" w:hAnsi="Consolas"/>
+          <w:b/>
+          <w:bCs/>
+          <w:color w:val="000000"/>
+          <w:sz w:val="19"/>
+          <w:szCs w:val="19"/>
+        </w:rPr>
+        <w:t xml:space="preserve">--agent-cmd</w:t>
+      </w:r>
+      <w:r>
+        <w:rPr>
+          <w:rFonts w:ascii="Times New Roman" w:eastAsia="SimSun" w:hAnsi="Times New Roman"/>
+          <w:b/>
+          <w:bCs/>
+          <w:color w:val="000000"/>
+          <w:sz w:val="21"/>
+          <w:szCs w:val="21"/>
+        </w:rPr>
+        <w:t xml:space="preserve">）：</w:t>
+      </w:r>
+      <w:r>
+        <w:rPr>
+          <w:rFonts w:ascii="Times New Roman" w:eastAsia="SimSun" w:hAnsi="Times New Roman"/>
+          <w:b w:val="false"/>
+          <w:bCs w:val="false"/>
+          <w:color w:val="000000"/>
+          <w:sz w:val="21"/>
+          <w:szCs w:val="21"/>
+        </w:rPr>
+        <w:t xml:space="preserve">外部智能体只需从标准输入读一行 JSON、向标准输出写一行 JSON（回答与取用的记忆 id），即可被调查、重放与回归，与语言无关；已用 Node.js 写的智能体完整跑通。命令不经过 shell 执行，但以本机权限运行，属受信任配置。目前仅命令行支持。</w:t>
+      </w:r>
+    </w:p>
+    <w:p>
+      <w:pPr>
+        <w:pStyle w:val="ListParagraph"/>
+        <w:numPr>
+          <w:ilvl w:val="0"/>
+          <w:numId w:val="2"/>
+        </w:numPr>
+        <w:spacing w:after="60" w:line="320"/>
+        <w:jc w:val="left"/>
+      </w:pPr>
+      <w:r>
+        <w:rPr>
+          <w:rFonts w:ascii="Times New Roman" w:eastAsia="SimSun" w:hAnsi="Times New Roman"/>
+          <w:b/>
+          <w:bCs/>
+          <w:color w:val="000000"/>
+          <w:sz w:val="21"/>
+          <w:szCs w:val="21"/>
+        </w:rPr>
         <w:t xml:space="preserve">memwall 导入：</w:t>
       </w:r>
       <w:r>
@@ -10120,7 +10175,7 @@
           <w:sz w:val="21"/>
           <w:szCs w:val="21"/>
         </w:rPr>
-        <w:t xml:space="preserve">Mem0 适配器每次读取都获取全部记忆（上限 10000 条），只适合小规模数据；</w:t>
+        <w:t xml:space="preserve">Mem0 的接口没有偏移或游标：适配器逐步放大读取上限直到取完，到上限会报错而不是静默截断；单条查找在本地嵌入式向量库中仍是线性扫描（开发机实测 1500 条约 0.26 秒，非基准）；只在 mem0ai 2.2.x 上测试；</w:t>
       </w:r>
     </w:p>
     <w:p>
@@ -12705,7 +12760,7 @@
                 <w:sz w:val="19"/>
                 <w:szCs w:val="19"/>
               </w:rPr>
-              <w:t xml:space="preserve">适配器隔离；参考实现不依赖外部框架；固定并记录验证过的版本。</w:t>
+              <w:t xml:space="preserve">适配器隔离；参考实现不依赖外部框架；可选依赖固定到已测试的小版本，适配器启动时对未测试的 Mem0 版本发出警告。</w:t>
             </w:r>
           </w:p>
         </w:tc>

</xml_diff>

<commit_message>
Add Letta adapter (archival memory) with real-server tests, Letta demos and test-environment script; web UI external agent (off by default)
Co-Authored-By: Claude Sonnet 5.5 <noreply@anthropic.com>
Claude-Session: https://claude.ai/code/session_01BuQd2CwyDwvp7AghJCtKtV
</commit_message>
<xml_diff>
--- a/docs/intro/Riffnel_memguard_作品介绍.docx
+++ b/docs/intro/Riffnel_memguard_作品介绍.docx
@@ -867,7 +867,7 @@
               <w:rFonts w:ascii="Times New Roman" w:eastAsia="SimSun"/>
               <w:sz w:val="22"/>
             </w:rPr>
-            <w:t>11</w:t>
+            <w:t>12</w:t>
           </w:r>
         </w:p>
         <w:p>
@@ -917,7 +917,7 @@
               <w:rFonts w:ascii="Times New Roman" w:eastAsia="SimSun"/>
               <w:sz w:val="22"/>
             </w:rPr>
-            <w:t>12</w:t>
+            <w:t>13</w:t>
           </w:r>
         </w:p>
         <w:p>
@@ -1272,7 +1272,7 @@
                 <w:sz w:val="19"/>
                 <w:szCs w:val="19"/>
               </w:rPr>
-              <w:t xml:space="preserve">v0.1 预览，已可运行：约 2500 行 Python 核心代码，69 项自动化测试，持续集成（Python 3.10、3.12、容器镜像）通过。适配器：JSON、SQLite、Mem0；另可导入 memwall 扫描结果。</w:t>
+              <w:t xml:space="preserve">v0.1 预览，已可运行：约 2500 行 Python 核心代码，77 项自动化测试，持续集成（Python 3.10、3.12、容器镜像）通过。适配器：JSON、SQLite、Mem0、Letta；另可导入 memwall 扫描结果。</w:t>
             </w:r>
           </w:p>
         </w:tc>
@@ -2144,7 +2144,29 @@
           <w:sz w:val="21"/>
           <w:szCs w:val="21"/>
         </w:rPr>
-        <w:t xml:space="preserve"> 只删除活动记忆，被删文字的完整内容（新增、更新、删除三类记录）仍保留在它的 SQLite 历史库中。也就是说，即便「调用了删除接口并返回成功」，数据仍可能留在同一套框架的另一张表里。这类残留需要被主动探测，而不能默认删除成功。</w:t>
+        <w:t xml:space="preserve"> 只删除活动记忆，被删文字的完整内容（新增、更新、删除三类记录）仍保留在它的 SQLite 历史库中。也就是说，即便「调用了删除接口并返回成功」，数据仍可能留在同一套框架的另一张表里。在 Letta 0.16.7 上我们看到另一种情形：删除单条归档记忆是硬删除（整库传储中找不到文本），但删除</w:t>
+      </w:r>
+      <w:r>
+        <w:rPr>
+          <w:rFonts w:ascii="Times New Roman" w:eastAsia="SimSun" w:hAnsi="Times New Roman"/>
+          <w:b/>
+          <w:bCs/>
+          <w:color w:val="000000"/>
+          <w:sz w:val="21"/>
+          <w:szCs w:val="21"/>
+        </w:rPr>
+        <w:t xml:space="preserve">智能体</w:t>
+      </w:r>
+      <w:r>
+        <w:rPr>
+          <w:rFonts w:ascii="Times New Roman" w:eastAsia="SimSun" w:hAnsi="Times New Roman"/>
+          <w:b w:val="false"/>
+          <w:bCs w:val="false"/>
+          <w:color w:val="000000"/>
+          <w:sz w:val="21"/>
+          <w:szCs w:val="21"/>
+        </w:rPr>
+        <w:t xml:space="preserve">并不会删除它的归档和归档记忆，文本仍留在数据库里。这类残留需要被主动探测，而不能默认删除成功。</w:t>
       </w:r>
     </w:p>
     <w:p>
@@ -5206,7 +5228,7 @@
           <w:sz w:val="21"/>
           <w:szCs w:val="21"/>
         </w:rPr>
-        <w:t xml:space="preserve">SQLite 适配器：</w:t>
+        <w:t xml:space="preserve">Letta 适配器：</w:t>
       </w:r>
       <w:r>
         <w:rPr>
@@ -5217,7 +5239,7 @@
           <w:sz w:val="21"/>
           <w:szCs w:val="21"/>
         </w:rPr>
-        <w:t xml:space="preserve">可映射已有表的列名，校验表名防注入；没有状态列时无法停用，会明确报错。</w:t>
+        <w:t xml:space="preserve">把 Letta 智能体的归档记忆当作记忆库。Letta 的归档记忆不能修改，所以字段存放在标签中，停用或改作用域通过「先写新条目、再删旧条目」完成，逻辑 id 不变；列出使用游标分页。在本机 Letta 0.16.7 上两个演示场景各跑通一次，6 项集成测试通过，并用 pg_dump 独立检查数据库。测试环境不是受支持的部署方式（需还原发布当日依赖、PostgreSQL，且需手动建表），持续集成中没有 Letta 服务端，相关测试被跳过。</w:t>
       </w:r>
     </w:p>
     <w:p>
@@ -5239,7 +5261,7 @@
           <w:sz w:val="21"/>
           <w:szCs w:val="21"/>
         </w:rPr>
-        <w:t xml:space="preserve">企业客服智能体示例：</w:t>
+        <w:t xml:space="preserve">SQLite 适配器：</w:t>
       </w:r>
       <w:r>
         <w:rPr>
@@ -5250,7 +5272,7 @@
           <w:sz w:val="21"/>
           <w:szCs w:val="21"/>
         </w:rPr>
-        <w:t xml:space="preserve">基于 Pydantic AI，固定策略（必须先调用检索工具、只依据返回内容回答、没有结果就拒答），记录每次检索，并生成事故。模型由环境变量选择，离线时使用确定性替身（不是语言模型）。</w:t>
+        <w:t xml:space="preserve">可映射已有表的列名，校验表名防注入；没有状态列时无法停用，会明确报错。</w:t>
       </w:r>
     </w:p>
     <w:p>
@@ -5272,6 +5294,39 @@
           <w:sz w:val="21"/>
           <w:szCs w:val="21"/>
         </w:rPr>
+        <w:t xml:space="preserve">企业客服智能体示例：</w:t>
+      </w:r>
+      <w:r>
+        <w:rPr>
+          <w:rFonts w:ascii="Times New Roman" w:eastAsia="SimSun" w:hAnsi="Times New Roman"/>
+          <w:b w:val="false"/>
+          <w:bCs w:val="false"/>
+          <w:color w:val="000000"/>
+          <w:sz w:val="21"/>
+          <w:szCs w:val="21"/>
+        </w:rPr>
+        <w:t xml:space="preserve">基于 Pydantic AI，固定策略（必须先调用检索工具、只依据返回内容回答、没有结果就拒答），记录每次检索，并生成事故。模型由环境变量选择，离线时使用确定性替身（不是语言模型）。</w:t>
+      </w:r>
+    </w:p>
+    <w:p>
+      <w:pPr>
+        <w:pStyle w:val="ListParagraph"/>
+        <w:numPr>
+          <w:ilvl w:val="0"/>
+          <w:numId w:val="2"/>
+        </w:numPr>
+        <w:spacing w:after="60" w:line="320"/>
+        <w:jc w:val="left"/>
+      </w:pPr>
+      <w:r>
+        <w:rPr>
+          <w:rFonts w:ascii="Times New Roman" w:eastAsia="SimSun" w:hAnsi="Times New Roman"/>
+          <w:b/>
+          <w:bCs/>
+          <w:color w:val="000000"/>
+          <w:sz w:val="21"/>
+          <w:szCs w:val="21"/>
+        </w:rPr>
         <w:t xml:space="preserve">任意智能体接入（</w:t>
       </w:r>
       <w:r>
@@ -5305,7 +5360,7 @@
           <w:sz w:val="21"/>
           <w:szCs w:val="21"/>
         </w:rPr>
-        <w:t xml:space="preserve">外部智能体只需从标准输入读一行 JSON、向标准输出写一行 JSON（回答与取用的记忆 id），即可被调查、重放与回归，与语言无关；已用 Node.js 写的智能体完整跑通。命令不经过 shell 执行，但以本机权限运行，属受信任配置。目前仅命令行支持。</w:t>
+        <w:t xml:space="preserve">外部智能体只需从标准输入读一行 JSON、向标准输出写一行 JSON（回答与取用的记忆 id），即可被调查、重放与回归，与语言无关；已用 Node.js 写的智能体完整跑通。命令不经过 shell 执行，但以本机权限运行，属受信任配置。Web 界面也可使用，但默认关闭（网页执行命令等于开放远程执行），需在本机可信环境显式启用。</w:t>
       </w:r>
     </w:p>
     <w:p>
@@ -6713,7 +6768,7 @@
                 <w:sz w:val="17"/>
                 <w:szCs w:val="17"/>
               </w:rPr>
-              <w:t xml:space="preserve">有状态智能体平台，记忆持久化</w:t>
+              <w:t xml:space="preserve">有状态智能体平台，记忆持久化；归档记忆可新增、列出、搜索、删除（不可修改）</w:t>
             </w:r>
           </w:p>
         </w:tc>
@@ -6749,7 +6804,7 @@
                 <w:sz w:val="17"/>
                 <w:szCs w:val="17"/>
               </w:rPr>
-              <w:t xml:space="preserve">记忆调试功能 README 未写。本项目未实现适配器（本地服务端在验证环境中无法启动）</w:t>
+              <w:t xml:space="preserve">README 未写记忆调试功能。本项目已实现归档记忆适配器并在本机 0.16.7 上测试；观察到删除智能体不删除其归档</w:t>
             </w:r>
           </w:p>
         </w:tc>
@@ -10219,7 +10274,7 @@
           <w:sz w:val="21"/>
           <w:szCs w:val="21"/>
         </w:rPr>
-        <w:t xml:space="preserve">Letta 适配器未实现：其本地服务端在验证环境中无法启动，我们不交付未经实际运行的适配器；</w:t>
+        <w:t xml:space="preserve">Letta 适配器只在本机 Letta 0.16.7 + letta-client 1.10.x 上测试：测试服务端需还原发布当日依赖、PostgreSQL，并手动建表，不是受支持的部署方式；每个场景只跑通一次演示，未做真实模型与真实嵌入器的多次验证；只覆盖归档记忆；持续集成无 Letta 服务端，相关测试被跳过；</w:t>
       </w:r>
     </w:p>
     <w:p>
@@ -11581,7 +11636,7 @@
                 <w:sz w:val="19"/>
                 <w:szCs w:val="19"/>
               </w:rPr>
-              <w:t xml:space="preserve">Letta 适配器（需固定可用的依赖版本或使用云服务）；PyPI 发布；Windows 与 macOS 持续集成；HTML 报告；从 OpenTelemetry 追踪导入事故。</w:t>
+              <w:t xml:space="preserve">Letta 适配器的真实模型与嵌入器验证、核心记忆块与会话消息；PyPI 发布；Windows 与 macOS 持续集成；HTML 报告；从 OpenTelemetry 追踪导入事故。</w:t>
             </w:r>
           </w:p>
         </w:tc>
@@ -13284,6 +13339,84 @@
                 <w:szCs w:val="17"/>
               </w:rPr>
               <w:t xml:space="preserve">真实堆栈（Mem0 + Pydantic AI）；可用环境变量接真实模型与嵌入器</w:t>
+            </w:r>
+          </w:p>
+        </w:tc>
+      </w:tr>
+      <w:tr>
+        <w:trPr>
+          <w:cantSplit/>
+          <w:tblHeader w:val="false"/>
+        </w:trPr>
+        <w:tc>
+          <w:tcPr>
+            <w:tcW w:type="dxa" w:w="4240"/>
+            <w:tcBorders>
+              <w:top w:val="single" w:color="000000" w:sz="4" w:space="1"/>
+              <w:left w:val="single" w:color="000000" w:sz="4" w:space="1"/>
+              <w:bottom w:val="single" w:color="000000" w:sz="4" w:space="1"/>
+              <w:right w:val="single" w:color="000000" w:sz="4" w:space="1"/>
+            </w:tcBorders>
+            <w:shd w:fill="FFFFFF" w:color="auto" w:val="clear"/>
+            <w:tcMar>
+              <w:top w:type="dxa" w:w="50"/>
+              <w:left w:type="dxa" w:w="100"/>
+              <w:bottom w:type="dxa" w:w="50"/>
+              <w:right w:type="dxa" w:w="100"/>
+            </w:tcMar>
+            <w:vAlign w:val="top"/>
+          </w:tcPr>
+          <w:p>
+            <w:pPr>
+              <w:spacing w:after="0" w:line="300"/>
+              <w:jc w:val="left"/>
+            </w:pPr>
+            <w:r>
+              <w:rPr>
+                <w:rFonts w:ascii="Consolas" w:eastAsia="SimSun" w:hAnsi="Consolas"/>
+                <w:b w:val="false"/>
+                <w:bCs w:val="false"/>
+                <w:color w:val="000000"/>
+                <w:sz w:val="16"/>
+                <w:szCs w:val="16"/>
+              </w:rPr>
+              <w:t xml:space="preserve">riffnel-memguard demo letta-stale | letta-erasure</w:t>
+            </w:r>
+          </w:p>
+        </w:tc>
+        <w:tc>
+          <w:tcPr>
+            <w:tcW w:type="dxa" w:w="5398"/>
+            <w:tcBorders>
+              <w:top w:val="single" w:color="000000" w:sz="4" w:space="1"/>
+              <w:left w:val="single" w:color="000000" w:sz="4" w:space="1"/>
+              <w:bottom w:val="single" w:color="000000" w:sz="4" w:space="1"/>
+              <w:right w:val="single" w:color="000000" w:sz="4" w:space="1"/>
+            </w:tcBorders>
+            <w:shd w:fill="FFFFFF" w:color="auto" w:val="clear"/>
+            <w:tcMar>
+              <w:top w:type="dxa" w:w="50"/>
+              <w:left w:type="dxa" w:w="100"/>
+              <w:bottom w:type="dxa" w:w="50"/>
+              <w:right w:type="dxa" w:w="100"/>
+            </w:tcMar>
+            <w:vAlign w:val="top"/>
+          </w:tcPr>
+          <w:p>
+            <w:pPr>
+              <w:spacing w:after="0" w:line="300"/>
+              <w:jc w:val="left"/>
+            </w:pPr>
+            <w:r>
+              <w:rPr>
+                <w:rFonts w:ascii="Times New Roman" w:eastAsia="SimSun" w:hAnsi="Times New Roman"/>
+                <w:b w:val="false"/>
+                <w:bCs w:val="false"/>
+                <w:color w:val="000000"/>
+                <w:sz w:val="17"/>
+                <w:szCs w:val="17"/>
+              </w:rPr>
+              <w:t xml:space="preserve">真实 Letta 服务端（需先运行，见 scripts/letta_test_env.sh）</w:t>
             </w:r>
           </w:p>
         </w:tc>

</xml_diff>

<commit_message>
Fix defects found by checking the tool against its own claims: erasure scrub of the workspace, plan state machine, approver policy, resumable apply, locking and atomic writes, signed audit log
Co-Authored-By: Claude Sonnet 5.5 <noreply@anthropic.com>
Claude-Session: https://claude.ai/code/session_01BuQd2CwyDwvp7AghJCtKtV
</commit_message>
<xml_diff>
--- a/docs/intro/Riffnel_memguard_作品介绍.docx
+++ b/docs/intro/Riffnel_memguard_作品介绍.docx
@@ -792,7 +792,7 @@
               <w:rFonts w:ascii="Times New Roman" w:eastAsia="SimSun"/>
               <w:sz w:val="22"/>
             </w:rPr>
-            <w:t>8</w:t>
+            <w:t>9</w:t>
           </w:r>
         </w:p>
         <w:p>
@@ -1272,7 +1272,7 @@
                 <w:sz w:val="19"/>
                 <w:szCs w:val="19"/>
               </w:rPr>
-              <w:t xml:space="preserve">v0.1 预览，已可运行：约 2500 行 Python 核心代码，77 项自动化测试，持续集成（Python 3.10、3.12、容器镜像）通过。适配器：JSON、SQLite、Mem0、Letta；另可导入 memwall 扫描结果。</w:t>
+              <w:t xml:space="preserve">v0.1 预览，已可运行：约 2500 行 Python 核心代码，93 项自动化测试，持续集成（Python 3.10、3.12、容器镜像）通过。适配器：JSON、SQLite、Mem0、Letta；另可导入 memwall 扫描结果。</w:t>
             </w:r>
           </w:p>
         </w:tc>
@@ -5124,7 +5124,95 @@
           <w:sz w:val="21"/>
           <w:szCs w:val="21"/>
         </w:rPr>
-        <w:t xml:space="preserve">过期记忆被「停用」而不是删除，并新增现行版本、保留取代关系；派生摘要一并清理。方案先以预演（diff）展示将发生的变更；只有审批后才能应用；停用、隔离、新增、改作用域均可回滚，删除不可回滚且会明确提示。已有一条符合来源的记忆时不重复新增。</w:t>
+        <w:t xml:space="preserve">过期记忆被「停用」而不是删除，并新增现行版本、保留取代关系；派生摘要一并清理。方案先以预演（diff）展示将发生的变更；方案状态被强制为 草稿 → 已审批 → 已应用（或应用中断）→ 已回滚，只有审批后才能应用，已应用的方案不能再审批或重复应用。审批人名单（</w:t>
+      </w:r>
+      <w:r>
+        <w:rPr>
+          <w:rFonts w:ascii="Consolas" w:eastAsia="SimSun" w:hAnsi="Consolas"/>
+          <w:b w:val="false"/>
+          <w:bCs w:val="false"/>
+          <w:color w:val="000000"/>
+          <w:sz w:val="19"/>
+          <w:szCs w:val="19"/>
+        </w:rPr>
+        <w:t xml:space="preserve">RIFFNEL_APPROVERS</w:t>
+      </w:r>
+      <w:r>
+        <w:rPr>
+          <w:rFonts w:ascii="Times New Roman" w:eastAsia="SimSun" w:hAnsi="Times New Roman"/>
+          <w:b w:val="false"/>
+          <w:bCs w:val="false"/>
+          <w:color w:val="000000"/>
+          <w:sz w:val="21"/>
+          <w:szCs w:val="21"/>
+        </w:rPr>
+        <w:t xml:space="preserve">）与「起草人不能审批自己的方案」（</w:t>
+      </w:r>
+      <w:r>
+        <w:rPr>
+          <w:rFonts w:ascii="Consolas" w:eastAsia="SimSun" w:hAnsi="Consolas"/>
+          <w:b w:val="false"/>
+          <w:bCs w:val="false"/>
+          <w:color w:val="000000"/>
+          <w:sz w:val="19"/>
+          <w:szCs w:val="19"/>
+        </w:rPr>
+        <w:t xml:space="preserve">RIFFNEL_FOUR_EYES</w:t>
+      </w:r>
+      <w:r>
+        <w:rPr>
+          <w:rFonts w:ascii="Times New Roman" w:eastAsia="SimSun" w:hAnsi="Times New Roman"/>
+          <w:b w:val="false"/>
+          <w:bCs w:val="false"/>
+          <w:color w:val="000000"/>
+          <w:sz w:val="21"/>
+          <w:szCs w:val="21"/>
+        </w:rPr>
+        <w:t xml:space="preserve">）可配置，但这是本地信任而不是身份认证。应用按动作逐个写日志：中途失败时方案停在 </w:t>
+      </w:r>
+      <w:r>
+        <w:rPr>
+          <w:rFonts w:ascii="Consolas" w:eastAsia="SimSun" w:hAnsi="Consolas"/>
+          <w:b w:val="false"/>
+          <w:bCs w:val="false"/>
+          <w:color w:val="000000"/>
+          <w:sz w:val="19"/>
+          <w:szCs w:val="19"/>
+        </w:rPr>
+        <w:t xml:space="preserve">apply_failed</w:t>
+      </w:r>
+      <w:r>
+        <w:rPr>
+          <w:rFonts w:ascii="Times New Roman" w:eastAsia="SimSun" w:hAnsi="Times New Roman"/>
+          <w:b w:val="false"/>
+          <w:bCs w:val="false"/>
+          <w:color w:val="000000"/>
+          <w:sz w:val="21"/>
+          <w:szCs w:val="21"/>
+        </w:rPr>
+        <w:t xml:space="preserve">，再次应用从断点继续（动作均幂等），回滚只撤销已完成的部分；这</w:t>
+      </w:r>
+      <w:r>
+        <w:rPr>
+          <w:rFonts w:ascii="Times New Roman" w:eastAsia="SimSun" w:hAnsi="Times New Roman"/>
+          <w:b/>
+          <w:bCs/>
+          <w:color w:val="000000"/>
+          <w:sz w:val="21"/>
+          <w:szCs w:val="21"/>
+        </w:rPr>
+        <w:t xml:space="preserve">不是事务</w:t>
+      </w:r>
+      <w:r>
+        <w:rPr>
+          <w:rFonts w:ascii="Times New Roman" w:eastAsia="SimSun" w:hAnsi="Times New Roman"/>
+          <w:b w:val="false"/>
+          <w:bCs w:val="false"/>
+          <w:color w:val="000000"/>
+          <w:sz w:val="21"/>
+          <w:szCs w:val="21"/>
+        </w:rPr>
+        <w:t xml:space="preserve">，各记忆库不提供跨多条记忆的事务。停用、隔离、新增、改作用域均可回滚，删除不可回滚且会明确提示。已有一条符合来源的记忆时不重复新增。</w:t>
       </w:r>
     </w:p>
     <w:p>
@@ -5157,7 +5245,7 @@
           <w:sz w:val="21"/>
           <w:szCs w:val="21"/>
         </w:rPr>
-        <w:t xml:space="preserve">删除请求的验证不信任「删除接口返回成功」。探测同时检查活动记忆、派生摘要、存储自带的历史行（trace），并让智能体回答探测问题以检查行为层。验证中另用不依赖本项目探测器的方式直接扫描数据目录原始字节，作为独立旁证。语义层在基准中误报较多（见第 9 节），因此只作人工复核提示。</w:t>
+        <w:t xml:space="preserve">删除请求的验证不信任「删除接口返回成功」。探测同时检查活动记忆、派生摘要、存储自带的历史行（trace），并让智能体回答探测问题以检查行为层。验证中另用不依赖本项目探测器的方式直接扫描数据目录原始字节，作为独立旁证。删除请求的目标值只暂存在权限 0600 的文件中，应用删除方案时清除工作区状态里所有含目标值的文本并删除含目标值的报告，验证通过后丢弃目标值；这一点是作者对照自己的说法检查后补上的（此前工作区状态会保留事故记录里的号码）。语义层在基准中误报较多（见第 9 节），因此只作人工复核提示。</w:t>
       </w:r>
     </w:p>
     <w:p>
@@ -10142,6 +10230,28 @@
           <w:sz w:val="21"/>
           <w:szCs w:val="21"/>
         </w:rPr>
+        <w:t xml:space="preserve">审批人是调用者输入的名字（本地信任，名单与四眼规则只是约束），不是身份认证；审计 HMAC 是对称的，持有密钥者可伪造；应用方案不是事务；文件锁未在 Windows 上测试，不适合网络文件系统；目标值在验证通过前以明文暂存于 0600 文件中；</w:t>
+      </w:r>
+    </w:p>
+    <w:p>
+      <w:pPr>
+        <w:pStyle w:val="ListParagraph"/>
+        <w:numPr>
+          <w:ilvl w:val="0"/>
+          <w:numId w:val="2"/>
+        </w:numPr>
+        <w:spacing w:after="60" w:line="320"/>
+        <w:jc w:val="left"/>
+      </w:pPr>
+      <w:r>
+        <w:rPr>
+          <w:rFonts w:ascii="Times New Roman" w:eastAsia="SimSun" w:hAnsi="Times New Roman"/>
+          <w:b w:val="false"/>
+          <w:bCs w:val="false"/>
+          <w:color w:val="000000"/>
+          <w:sz w:val="21"/>
+          <w:szCs w:val="21"/>
+        </w:rPr>
         <w:t xml:space="preserve">真实模型验证只覆盖 M1 与 M5，只用了一个模型和一个嵌入模型，每个场景 5 到 10 次，模型输出有随机性；</w:t>
       </w:r>
     </w:p>
@@ -10950,7 +11060,7 @@
                 <w:sz w:val="19"/>
                 <w:szCs w:val="19"/>
               </w:rPr>
-              <w:t xml:space="preserve">默认离线、无遥测；报告与界面对长数字遮罩；审计日志不记录被删内容；对 Mem0 默认遥测强制关闭。</w:t>
+              <w:t xml:space="preserve">默认离线、无遥测；报告与界面对长数字与邮箱遮罩；审计日志不记录被删内容；删除请求完成后清除工作区内的目标值副本；对 Mem0 默认遥测强制关闭。无法覆盖 shell 历史、备份、副本等工作区之外的位置。</w:t>
             </w:r>
           </w:p>
         </w:tc>

</xml_diff>